<commit_message>
status for tasks updated
</commit_message>
<xml_diff>
--- a/random_bullshit_go.docx
+++ b/random_bullshit_go.docx
@@ -45,110 +45,144 @@
       </w:pPr>
       <w:r>
         <w:rPr/>
-        <w:t>CRITICAL – Render Obor</w:t>
-      </w:r>
-    </w:p>
-    <w:p>
-      <w:pPr>
-        <w:pStyle w:val="Normal"/>
-        <w:bidi w:val="0"/>
-        <w:jc w:val="start"/>
-        <w:rPr/>
-      </w:pPr>
-      <w:r>
-        <w:rPr/>
-      </w:r>
-    </w:p>
-    <w:p>
-      <w:pPr>
-        <w:pStyle w:val="Normal"/>
-        <w:bidi w:val="0"/>
-        <w:jc w:val="start"/>
-        <w:rPr/>
-      </w:pPr>
-      <w:r>
-        <w:rPr/>
-        <w:t>HIGH – fix camera POV dacie</w:t>
-      </w:r>
-    </w:p>
-    <w:p>
-      <w:pPr>
-        <w:pStyle w:val="Normal"/>
-        <w:bidi w:val="0"/>
-        <w:jc w:val="start"/>
-        <w:rPr/>
-      </w:pPr>
-      <w:r>
-        <w:rPr/>
-      </w:r>
-    </w:p>
-    <w:p>
-      <w:pPr>
-        <w:pStyle w:val="Normal"/>
-        <w:bidi w:val="0"/>
-        <w:jc w:val="start"/>
-        <w:rPr/>
-      </w:pPr>
-      <w:r>
-        <w:rPr/>
-        <w:t>MEDIUM – WASD pe tot ce e randuit fara dacie</w:t>
-      </w:r>
-    </w:p>
-    <w:p>
-      <w:pPr>
-        <w:pStyle w:val="Normal"/>
-        <w:bidi w:val="0"/>
-        <w:jc w:val="start"/>
-        <w:rPr/>
-      </w:pPr>
-      <w:r>
-        <w:rPr/>
-      </w:r>
-    </w:p>
-    <w:p>
-      <w:pPr>
-        <w:pStyle w:val="Normal"/>
-        <w:bidi w:val="0"/>
-        <w:jc w:val="start"/>
-        <w:rPr/>
-      </w:pPr>
-      <w:r>
-        <w:rPr/>
-        <w:t>LOW – gandit tranzitie intre obor – pantelimon</w:t>
-      </w:r>
-    </w:p>
-    <w:p>
-      <w:pPr>
-        <w:pStyle w:val="Normal"/>
-        <w:bidi w:val="0"/>
-        <w:jc w:val="start"/>
-        <w:rPr/>
-      </w:pPr>
-      <w:r>
-        <w:rPr/>
-      </w:r>
-    </w:p>
-    <w:p>
-      <w:pPr>
-        <w:pStyle w:val="Normal"/>
-        <w:bidi w:val="0"/>
-        <w:jc w:val="start"/>
-        <w:rPr/>
-      </w:pPr>
-      <w:r>
-        <w:rPr/>
-        <w:t>LOW – arme pantelimoneze de hand to hand combat – telescopica,lant,box, robinet de chiuveta</w:t>
-      </w:r>
-    </w:p>
-    <w:p>
-      <w:pPr>
-        <w:pStyle w:val="Normal"/>
-        <w:bidi w:val="0"/>
-        <w:jc w:val="start"/>
-        <w:rPr/>
-      </w:pPr>
-      <w:r>
-        <w:rPr/>
+        <w:t xml:space="preserve">CRITICAL – Render Obor - </w:t>
+      </w:r>
+      <w:r>
+        <w:rPr/>
+        <w:t>DONE</w:t>
+      </w:r>
+    </w:p>
+    <w:p>
+      <w:pPr>
+        <w:pStyle w:val="Normal"/>
+        <w:bidi w:val="0"/>
+        <w:jc w:val="start"/>
+        <w:rPr/>
+      </w:pPr>
+      <w:r>
+        <w:rPr/>
+      </w:r>
+    </w:p>
+    <w:p>
+      <w:pPr>
+        <w:pStyle w:val="Normal"/>
+        <w:bidi w:val="0"/>
+        <w:jc w:val="start"/>
+        <w:rPr/>
+      </w:pPr>
+      <w:r>
+        <w:rPr/>
+        <w:t xml:space="preserve">HIGH – fix camera POV dacie – </w:t>
+      </w:r>
+      <w:r>
+        <w:rPr/>
+        <w:t>OBSOLETE</w:t>
+      </w:r>
+    </w:p>
+    <w:p>
+      <w:pPr>
+        <w:pStyle w:val="Normal"/>
+        <w:bidi w:val="0"/>
+        <w:jc w:val="start"/>
+        <w:rPr/>
+      </w:pPr>
+      <w:r>
+        <w:rPr/>
+      </w:r>
+    </w:p>
+    <w:p>
+      <w:pPr>
+        <w:pStyle w:val="Normal"/>
+        <w:bidi w:val="0"/>
+        <w:jc w:val="start"/>
+        <w:rPr/>
+      </w:pPr>
+      <w:r>
+        <w:rPr/>
+        <w:t xml:space="preserve">MEDIUM – WASD pe tot ce e randuit fara dacie - </w:t>
+      </w:r>
+      <w:r>
+        <w:rPr/>
+        <w:t>DONE</w:t>
+      </w:r>
+    </w:p>
+    <w:p>
+      <w:pPr>
+        <w:pStyle w:val="Normal"/>
+        <w:bidi w:val="0"/>
+        <w:jc w:val="start"/>
+        <w:rPr/>
+      </w:pPr>
+      <w:r>
+        <w:rPr/>
+      </w:r>
+    </w:p>
+    <w:p>
+      <w:pPr>
+        <w:pStyle w:val="Normal"/>
+        <w:bidi w:val="0"/>
+        <w:jc w:val="start"/>
+        <w:rPr/>
+      </w:pPr>
+      <w:r>
+        <w:rPr/>
+        <w:t xml:space="preserve">LOW – arme pantelimoneze de hand to hand combat – telescopica,lant,box, robinet de chiuveta - </w:t>
+      </w:r>
+      <w:r>
+        <w:rPr/>
+        <w:t>LATER</w:t>
+      </w:r>
+    </w:p>
+    <w:p>
+      <w:pPr>
+        <w:pStyle w:val="Normal"/>
+        <w:bidi w:val="0"/>
+        <w:jc w:val="start"/>
+        <w:rPr/>
+      </w:pPr>
+      <w:r>
+        <w:rPr/>
+        <w:br/>
+        <w:t>LOW – Radio Puya</w:t>
+      </w:r>
+    </w:p>
+    <w:p>
+      <w:pPr>
+        <w:pStyle w:val="Normal"/>
+        <w:bidi w:val="0"/>
+        <w:jc w:val="start"/>
+        <w:rPr/>
+      </w:pPr>
+      <w:r>
+        <w:rPr/>
+        <w:br/>
+      </w:r>
+      <w:r>
+        <w:rPr/>
+        <w:t>MEDIUM – redesign Dacie</w:t>
+      </w:r>
+    </w:p>
+    <w:p>
+      <w:pPr>
+        <w:pStyle w:val="Normal"/>
+        <w:bidi w:val="0"/>
+        <w:jc w:val="start"/>
+        <w:rPr/>
+      </w:pPr>
+      <w:r>
+        <w:rPr/>
+      </w:r>
+    </w:p>
+    <w:p>
+      <w:pPr>
+        <w:pStyle w:val="Normal"/>
+        <w:bidi w:val="0"/>
+        <w:jc w:val="start"/>
+        <w:rPr/>
+      </w:pPr>
+      <w:r>
+        <w:rPr/>
+        <w:t>HIGH – start CI/CD tests pt sky-view controls, sunt superbe nu trebe schimbate ever</w:t>
       </w:r>
     </w:p>
     <w:p>
@@ -615,6 +649,7 @@
       <w:pgNumType w:fmt="decimal"/>
       <w:formProt w:val="false"/>
       <w:textDirection w:val="lrTb"/>
+      <w:docGrid w:type="default" w:linePitch="100" w:charSpace="0"/>
     </w:sectPr>
   </w:body>
 </w:document>
@@ -634,7 +669,6 @@
     </w:rPrDefault>
     <w:pPrDefault>
       <w:pPr>
-        <w:widowControl/>
         <w:suppressAutoHyphens w:val="true"/>
       </w:pPr>
     </w:pPrDefault>
@@ -644,7 +678,10 @@
     <w:qFormat/>
     <w:pPr>
       <w:widowControl/>
+      <w:suppressAutoHyphens w:val="true"/>
       <w:bidi w:val="0"/>
+      <w:spacing w:before="0" w:after="0"/>
+      <w:jc w:val="start"/>
     </w:pPr>
     <w:rPr>
       <w:rFonts w:ascii="Liberation Serif" w:hAnsi="Liberation Serif" w:eastAsia="Noto Serif CJK SC" w:cs="Noto Sans Devanagari"/>

</xml_diff>

<commit_message>
took info from plenar, added it to todo list
</commit_message>
<xml_diff>
--- a/random_bullshit_go.docx
+++ b/random_bullshit_go.docx
@@ -45,92 +45,76 @@
       </w:pPr>
       <w:r>
         <w:rPr/>
-        <w:t xml:space="preserve">CRITICAL – Render Obor - </w:t>
-      </w:r>
-      <w:r>
-        <w:rPr/>
-        <w:t>DONE</w:t>
-      </w:r>
-    </w:p>
-    <w:p>
-      <w:pPr>
-        <w:pStyle w:val="Normal"/>
-        <w:bidi w:val="0"/>
-        <w:jc w:val="start"/>
-        <w:rPr/>
-      </w:pPr>
-      <w:r>
-        <w:rPr/>
-      </w:r>
-    </w:p>
-    <w:p>
-      <w:pPr>
-        <w:pStyle w:val="Normal"/>
-        <w:bidi w:val="0"/>
-        <w:jc w:val="start"/>
-        <w:rPr/>
-      </w:pPr>
-      <w:r>
-        <w:rPr/>
-        <w:t xml:space="preserve">HIGH – fix camera POV dacie – </w:t>
-      </w:r>
-      <w:r>
-        <w:rPr/>
-        <w:t>OBSOLETE</w:t>
-      </w:r>
-    </w:p>
-    <w:p>
-      <w:pPr>
-        <w:pStyle w:val="Normal"/>
-        <w:bidi w:val="0"/>
-        <w:jc w:val="start"/>
-        <w:rPr/>
-      </w:pPr>
-      <w:r>
-        <w:rPr/>
-      </w:r>
-    </w:p>
-    <w:p>
-      <w:pPr>
-        <w:pStyle w:val="Normal"/>
-        <w:bidi w:val="0"/>
-        <w:jc w:val="start"/>
-        <w:rPr/>
-      </w:pPr>
-      <w:r>
-        <w:rPr/>
-        <w:t xml:space="preserve">MEDIUM – WASD pe tot ce e randuit fara dacie - </w:t>
-      </w:r>
-      <w:r>
-        <w:rPr/>
-        <w:t>DONE</w:t>
-      </w:r>
-    </w:p>
-    <w:p>
-      <w:pPr>
-        <w:pStyle w:val="Normal"/>
-        <w:bidi w:val="0"/>
-        <w:jc w:val="start"/>
-        <w:rPr/>
-      </w:pPr>
-      <w:r>
-        <w:rPr/>
-      </w:r>
-    </w:p>
-    <w:p>
-      <w:pPr>
-        <w:pStyle w:val="Normal"/>
-        <w:bidi w:val="0"/>
-        <w:jc w:val="start"/>
-        <w:rPr/>
-      </w:pPr>
-      <w:r>
-        <w:rPr/>
-        <w:t xml:space="preserve">LOW – arme pantelimoneze de hand to hand combat – telescopica,lant,box, robinet de chiuveta - </w:t>
-      </w:r>
-      <w:r>
-        <w:rPr/>
-        <w:t>LATER</w:t>
+        <w:t>CRITICAL – Render Obor - DONE</w:t>
+      </w:r>
+    </w:p>
+    <w:p>
+      <w:pPr>
+        <w:pStyle w:val="Normal"/>
+        <w:bidi w:val="0"/>
+        <w:jc w:val="start"/>
+        <w:rPr/>
+      </w:pPr>
+      <w:r>
+        <w:rPr/>
+      </w:r>
+    </w:p>
+    <w:p>
+      <w:pPr>
+        <w:pStyle w:val="Normal"/>
+        <w:bidi w:val="0"/>
+        <w:jc w:val="start"/>
+        <w:rPr/>
+      </w:pPr>
+      <w:r>
+        <w:rPr/>
+        <w:t>HIGH – fix camera POV dacie – OBSOLETE</w:t>
+      </w:r>
+    </w:p>
+    <w:p>
+      <w:pPr>
+        <w:pStyle w:val="Normal"/>
+        <w:bidi w:val="0"/>
+        <w:jc w:val="start"/>
+        <w:rPr/>
+      </w:pPr>
+      <w:r>
+        <w:rPr/>
+      </w:r>
+    </w:p>
+    <w:p>
+      <w:pPr>
+        <w:pStyle w:val="Normal"/>
+        <w:bidi w:val="0"/>
+        <w:jc w:val="start"/>
+        <w:rPr/>
+      </w:pPr>
+      <w:r>
+        <w:rPr/>
+        <w:t>MEDIUM – WASD pe tot ce e randuit fara dacie - DONE</w:t>
+      </w:r>
+    </w:p>
+    <w:p>
+      <w:pPr>
+        <w:pStyle w:val="Normal"/>
+        <w:bidi w:val="0"/>
+        <w:jc w:val="start"/>
+        <w:rPr/>
+      </w:pPr>
+      <w:r>
+        <w:rPr/>
+      </w:r>
+    </w:p>
+    <w:p>
+      <w:pPr>
+        <w:pStyle w:val="Normal"/>
+        <w:bidi w:val="0"/>
+        <w:jc w:val="start"/>
+        <w:rPr/>
+      </w:pPr>
+      <w:r>
+        <w:rPr/>
+        <w:t>LOW – arme pantelimoneze de hand to hand combat – telescopica,lant,box, robinet de chiuveta - LATER</w:t>
       </w:r>
     </w:p>
     <w:p>
@@ -156,9 +140,6 @@
       <w:r>
         <w:rPr/>
         <w:br/>
-      </w:r>
-      <w:r>
-        <w:rPr/>
         <w:t>MEDIUM – redesign Dacie</w:t>
       </w:r>
     </w:p>
@@ -205,6 +186,30 @@
       </w:pPr>
       <w:r>
         <w:rPr/>
+        <w:t>MEDIUM – add pantelimonu petrece dupa loadu jocului</w:t>
+      </w:r>
+    </w:p>
+    <w:p>
+      <w:pPr>
+        <w:pStyle w:val="Normal"/>
+        <w:bidi w:val="0"/>
+        <w:jc w:val="start"/>
+        <w:rPr/>
+      </w:pPr>
+      <w:r>
+        <w:rPr/>
+      </w:r>
+    </w:p>
+    <w:p>
+      <w:pPr>
+        <w:pStyle w:val="Normal"/>
+        <w:bidi w:val="0"/>
+        <w:jc w:val="start"/>
+        <w:rPr/>
+      </w:pPr>
+      <w:r>
+        <w:rPr/>
+        <w:t>LOW  –  add radio cur</w:t>
       </w:r>
     </w:p>
     <w:p>

</xml_diff>